<commit_message>
Merge leg and wheel figures with vertically stacked wheel panels
</commit_message>
<xml_diff>
--- a/Article二改稿增补_内容略删减_引言及参考文献整合.docx
+++ b/Article二改稿增补_内容略删减_引言及参考文献整合.docx
@@ -2688,14 +2688,14 @@
           <w:sz w:val="20"/>
           <w:szCs w:val="20"/>
         </w:rPr>
-        <w:t>I，Fig.</w:t>
-      </w:r>
-      <w:r>
-        <w:rPr>
-          <w:sz w:val="20"/>
-          <w:szCs w:val="20"/>
-        </w:rPr>
-        <w:t xml:space="preserve"> 3 </w:t>
+        <w:t>I，Fig. 3(a)</w:t>
+      </w:r>
+      <w:r>
+        <w:rPr>
+          <w:sz w:val="20"/>
+          <w:szCs w:val="20"/>
+        </w:rPr>
+        <w:t xml:space="preserve"> </w:t>
       </w:r>
       <w:r>
         <w:rPr>
@@ -2706,59 +2706,283 @@
         <w:t>给出单腿结构与坐标系示意。</w:t>
       </w:r>
     </w:p>
-    <w:p>
-      <w:pPr>
-        <w:keepNext/>
-        <w:keepLines/>
-        <w:numPr>
-          <w:ilvl w:val="0"/>
-          <w:numId w:val="0"/>
-        </w:numPr>
-        <w:snapToGrid w:val="0"/>
-        <w:spacing w:before="60" w:after="60" w:line="240" w:lineRule="auto"/>
-        <w:ind w:left="0" w:right="0" w:firstLine="0"/>
+    <w:tbl>
+      <w:tblPr>
+        <w:tblW w:w="4866" w:type="dxa"/>
         <w:jc w:val="center"/>
-      </w:pPr>
-      <w:r>
-        <w:drawing>
-          <wp:inline distT="0" distB="0" distL="0" distR="0">
-            <wp:extent cx="1619885" cy="2446655"/>
-            <wp:effectExtent l="0" t="0" r="8890" b="1270"/>
-            <wp:docPr id="24" name="Fig. 3" descr="单腿结构与坐标系示意图"/>
-            <wp:cNvGraphicFramePr>
-              <a:graphicFrameLocks xmlns:a="http://schemas.openxmlformats.org/drawingml/2006/main" noChangeAspect="1"/>
-            </wp:cNvGraphicFramePr>
-            <a:graphic xmlns:a="http://schemas.openxmlformats.org/drawingml/2006/main">
-              <a:graphicData uri="http://schemas.openxmlformats.org/drawingml/2006/picture">
-                <pic:pic xmlns:pic="http://schemas.openxmlformats.org/drawingml/2006/picture">
-                  <pic:nvPicPr>
-                    <pic:cNvPr id="24" name="Fig. 3" descr="单腿结构与坐标系示意图"/>
-                    <pic:cNvPicPr>
-                      <a:picLocks noChangeAspect="1"/>
-                    </pic:cNvPicPr>
-                  </pic:nvPicPr>
-                  <pic:blipFill>
-                    <a:blip r:embed="rId7"/>
-                    <a:stretch>
-                      <a:fillRect/>
-                    </a:stretch>
-                  </pic:blipFill>
-                  <pic:spPr>
-                    <a:xfrm>
-                      <a:off x="0" y="0"/>
-                      <a:ext cx="1620000" cy="2447057"/>
-                    </a:xfrm>
-                    <a:prstGeom prst="rect">
-                      <a:avLst/>
-                    </a:prstGeom>
-                  </pic:spPr>
-                </pic:pic>
-              </a:graphicData>
-            </a:graphic>
-          </wp:inline>
-        </w:drawing>
-      </w:r>
-    </w:p>
+        <w:tblBorders>
+          <w:top w:val="nil"/>
+          <w:left w:val="nil"/>
+          <w:bottom w:val="nil"/>
+          <w:right w:val="nil"/>
+          <w:insideH w:val="nil"/>
+          <w:insideV w:val="nil"/>
+        </w:tblBorders>
+        <w:tblLayout w:type="fixed"/>
+        <w:tblCellMar>
+          <w:top w:w="0" w:type="dxa"/>
+          <w:left w:w="40" w:type="dxa"/>
+          <w:bottom w:w="0" w:type="dxa"/>
+          <w:right w:w="40" w:type="dxa"/>
+        </w:tblCellMar>
+      </w:tblPr>
+      <w:tblGrid>
+        <w:gridCol w:w="2635"/>
+        <w:gridCol w:w="2231"/>
+      </w:tblGrid>
+      <w:tr>
+        <w:trPr>
+          <w:cantSplit/>
+        </w:trPr>
+        <w:tc>
+          <w:tcPr>
+            <w:tcW w:w="2635" w:type="dxa"/>
+            <w:vAlign w:val="center"/>
+          </w:tcPr>
+          <w:p>
+            <w:pPr>
+              <w:keepNext/>
+              <w:keepLines/>
+              <w:numPr>
+                <w:ilvl w:val="0"/>
+                <w:numId w:val="0"/>
+              </w:numPr>
+              <w:snapToGrid w:val="0"/>
+              <w:spacing w:before="60" w:after="60" w:line="240" w:lineRule="auto"/>
+              <w:ind w:left="0" w:right="0" w:firstLine="0"/>
+              <w:jc w:val="center"/>
+            </w:pPr>
+            <w:r>
+              <w:drawing>
+                <wp:inline distT="0" distB="0" distL="0" distR="0">
+                  <wp:extent cx="1620000" cy="2446829"/>
+                  <wp:effectExtent l="0" t="0" r="0" b="0"/>
+                  <wp:docPr id="24" name="Fig. 3(a)" descr="Leg structure and coordinate frames"/>
+                  <wp:cNvGraphicFramePr>
+                    <a:graphicFrameLocks xmlns:a="http://schemas.openxmlformats.org/drawingml/2006/main" noChangeAspect="1"/>
+                  </wp:cNvGraphicFramePr>
+                  <a:graphic xmlns:a="http://schemas.openxmlformats.org/drawingml/2006/main">
+                    <a:graphicData uri="http://schemas.openxmlformats.org/drawingml/2006/picture">
+                      <pic:pic xmlns:pic="http://schemas.openxmlformats.org/drawingml/2006/picture">
+                        <pic:nvPicPr>
+                          <pic:cNvPr id="24" name="Fig. 3(a)" descr="Leg structure and coordinate frames"/>
+                          <pic:cNvPicPr>
+                            <a:picLocks noChangeAspect="1"/>
+                          </pic:cNvPicPr>
+                        </pic:nvPicPr>
+                        <pic:blipFill>
+                          <a:blip r:embed="rId7"/>
+                          <a:stretch>
+                            <a:fillRect/>
+                          </a:stretch>
+                        </pic:blipFill>
+                        <pic:spPr>
+                          <a:xfrm>
+                            <a:off x="0" y="0"/>
+                            <a:ext cx="1620000" cy="2446829"/>
+                          </a:xfrm>
+                          <a:prstGeom prst="rect">
+                            <a:avLst/>
+                          </a:prstGeom>
+                        </pic:spPr>
+                      </pic:pic>
+                    </a:graphicData>
+                  </a:graphic>
+                </wp:inline>
+              </w:drawing>
+            </w:r>
+          </w:p>
+          <w:p>
+            <w:pPr>
+              <w:pStyle w:val="18"/>
+              <w:keepNext/>
+              <w:keepLines/>
+              <w:numPr>
+                <w:ilvl w:val="0"/>
+                <w:numId w:val="0"/>
+              </w:numPr>
+              <w:snapToGrid w:val="0"/>
+              <w:spacing w:before="0" w:after="60" w:line="240" w:lineRule="auto"/>
+              <w:ind w:left="0" w:right="0" w:firstLine="0"/>
+              <w:jc w:val="center"/>
+            </w:pPr>
+            <w:r>
+              <w:rPr>
+                <w:rFonts w:ascii="Times New Roman" w:hAnsi="Times New Roman"/>
+                <w:sz w:val="18"/>
+                <w:szCs w:val="18"/>
+              </w:rPr>
+              <w:t>(a) Leg structure</w:t>
+            </w:r>
+          </w:p>
+        </w:tc>
+        <w:tc>
+          <w:tcPr>
+            <w:tcW w:w="2231" w:type="dxa"/>
+            <w:vAlign w:val="center"/>
+          </w:tcPr>
+          <w:p>
+            <w:pPr>
+              <w:keepNext/>
+              <w:numPr>
+                <w:ilvl w:val="0"/>
+                <w:numId w:val="0"/>
+              </w:numPr>
+              <w:snapToGrid w:val="0"/>
+              <w:spacing w:before="0" w:after="40" w:line="240" w:lineRule="auto"/>
+              <w:ind w:left="0" w:right="0" w:firstLine="0"/>
+              <w:jc w:val="center"/>
+            </w:pPr>
+            <w:r>
+              <w:drawing>
+                <wp:inline distT="0" distB="0" distL="0" distR="0">
+                  <wp:extent cx="1350000" cy="438884"/>
+                  <wp:effectExtent l="0" t="0" r="0" b="0"/>
+                  <wp:docPr id="20" name="Fig. 3(b)" descr="Type A Mecanum wheel"/>
+                  <wp:cNvGraphicFramePr>
+                    <a:graphicFrameLocks xmlns:a="http://schemas.openxmlformats.org/drawingml/2006/main" noChangeAspect="1"/>
+                  </wp:cNvGraphicFramePr>
+                  <a:graphic xmlns:a="http://schemas.openxmlformats.org/drawingml/2006/main">
+                    <a:graphicData uri="http://schemas.openxmlformats.org/drawingml/2006/picture">
+                      <pic:pic xmlns:pic="http://schemas.openxmlformats.org/drawingml/2006/picture">
+                        <pic:nvPicPr>
+                          <pic:cNvPr id="20" name="Fig. 3(b)" descr="Type A Mecanum wheel"/>
+                          <pic:cNvPicPr>
+                            <a:picLocks noChangeAspect="1" noChangeArrowheads="1"/>
+                          </pic:cNvPicPr>
+                        </pic:nvPicPr>
+                        <pic:blipFill>
+                          <a:blip r:embed="rId8"/>
+                          <a:srcRect l="4706" t="17564" r="8015" b="15381"/>
+                          <a:stretch>
+                            <a:fillRect/>
+                          </a:stretch>
+                        </pic:blipFill>
+                        <pic:spPr>
+                          <a:xfrm>
+                            <a:off x="0" y="0"/>
+                            <a:ext cx="1350000" cy="438884"/>
+                          </a:xfrm>
+                          <a:prstGeom prst="rect">
+                            <a:avLst/>
+                          </a:prstGeom>
+                          <a:noFill/>
+                          <a:ln w="9525">
+                            <a:noFill/>
+                          </a:ln>
+                        </pic:spPr>
+                      </pic:pic>
+                    </a:graphicData>
+                  </a:graphic>
+                </wp:inline>
+              </w:drawing>
+            </w:r>
+          </w:p>
+          <w:p>
+            <w:pPr>
+              <w:pStyle w:val="18"/>
+              <w:keepNext/>
+              <w:keepLines/>
+              <w:numPr>
+                <w:ilvl w:val="0"/>
+                <w:numId w:val="0"/>
+              </w:numPr>
+              <w:snapToGrid w:val="0"/>
+              <w:spacing w:before="0" w:after="60" w:line="240" w:lineRule="auto"/>
+              <w:ind w:left="0" w:right="0" w:firstLine="0"/>
+              <w:jc w:val="center"/>
+            </w:pPr>
+            <w:r>
+              <w:rPr>
+                <w:rFonts w:ascii="Times New Roman" w:hAnsi="Times New Roman"/>
+                <w:sz w:val="18"/>
+                <w:szCs w:val="18"/>
+              </w:rPr>
+              <w:t>(b) Type A</w:t>
+            </w:r>
+          </w:p>
+          <w:p>
+            <w:pPr>
+              <w:keepNext/>
+              <w:numPr>
+                <w:ilvl w:val="0"/>
+                <w:numId w:val="0"/>
+              </w:numPr>
+              <w:snapToGrid w:val="0"/>
+              <w:spacing w:before="0" w:after="40" w:line="240" w:lineRule="auto"/>
+              <w:ind w:left="0" w:right="0" w:firstLine="0"/>
+              <w:jc w:val="center"/>
+            </w:pPr>
+            <w:r>
+              <w:drawing>
+                <wp:inline distT="0" distB="0" distL="0" distR="0">
+                  <wp:extent cx="1350000" cy="432333"/>
+                  <wp:effectExtent l="0" t="0" r="0" b="0"/>
+                  <wp:docPr id="23" name="Fig. 3(c)" descr="Type B Mecanum wheel"/>
+                  <wp:cNvGraphicFramePr>
+                    <a:graphicFrameLocks xmlns:a="http://schemas.openxmlformats.org/drawingml/2006/main" noChangeAspect="1"/>
+                  </wp:cNvGraphicFramePr>
+                  <a:graphic xmlns:a="http://schemas.openxmlformats.org/drawingml/2006/main">
+                    <a:graphicData uri="http://schemas.openxmlformats.org/drawingml/2006/picture">
+                      <pic:pic xmlns:pic="http://schemas.openxmlformats.org/drawingml/2006/picture">
+                        <pic:nvPicPr>
+                          <pic:cNvPr id="23" name="Fig. 3(c)" descr="Type B Mecanum wheel"/>
+                          <pic:cNvPicPr>
+                            <a:picLocks noChangeAspect="1" noChangeArrowheads="1"/>
+                          </pic:cNvPicPr>
+                        </pic:nvPicPr>
+                        <pic:blipFill>
+                          <a:blip r:embed="rId9"/>
+                          <a:stretch>
+                            <a:fillRect/>
+                          </a:stretch>
+                        </pic:blipFill>
+                        <pic:spPr>
+                          <a:xfrm>
+                            <a:off x="0" y="0"/>
+                            <a:ext cx="1350000" cy="432333"/>
+                          </a:xfrm>
+                          <a:prstGeom prst="rect">
+                            <a:avLst/>
+                          </a:prstGeom>
+                          <a:noFill/>
+                          <a:ln w="9525">
+                            <a:noFill/>
+                          </a:ln>
+                        </pic:spPr>
+                      </pic:pic>
+                    </a:graphicData>
+                  </a:graphic>
+                </wp:inline>
+              </w:drawing>
+            </w:r>
+          </w:p>
+          <w:p>
+            <w:pPr>
+              <w:pStyle w:val="18"/>
+              <w:keepNext/>
+              <w:keepLines/>
+              <w:numPr>
+                <w:ilvl w:val="0"/>
+                <w:numId w:val="0"/>
+              </w:numPr>
+              <w:snapToGrid w:val="0"/>
+              <w:spacing w:before="0" w:after="60" w:line="240" w:lineRule="auto"/>
+              <w:ind w:left="0" w:right="0" w:firstLine="0"/>
+              <w:jc w:val="center"/>
+            </w:pPr>
+            <w:r>
+              <w:rPr>
+                <w:rFonts w:ascii="Times New Roman" w:hAnsi="Times New Roman"/>
+                <w:sz w:val="18"/>
+                <w:szCs w:val="18"/>
+              </w:rPr>
+              <w:t>(c) Type B</w:t>
+            </w:r>
+          </w:p>
+        </w:tc>
+      </w:tr>
+    </w:tbl>
     <w:p>
       <w:pPr>
         <w:pStyle w:val="18"/>
@@ -2779,7 +3003,7 @@
           <w:rFonts w:hint="eastAsia"/>
           <w:iCs/>
         </w:rPr>
-        <w:t>单腿结构与坐标系示意（图中角度标记表示机构几何关系，解算零位以正文为准）。</w:t>
+        <w:t>单腿与麦克纳姆轮结构。（a）单腿结构与坐标系示意，图中角度标记表示机构几何关系，解算零位以正文为准。（b）A 型麦克纳姆轮。（c）B 型麦克纳姆轮。</w:t>
       </w:r>
     </w:p>
     <w:p>
@@ -7205,14 +7429,14 @@
           <w:sz w:val="20"/>
           <w:szCs w:val="20"/>
         </w:rPr>
-        <w:t>麦克纳姆轮由主动轮毂和沿轮缘分布的被动辊子组成，辊子手性决定侧向速度与轮毂转速之间的符号关系。Fig.</w:t>
-      </w:r>
-      <w:r>
-        <w:rPr>
-          <w:sz w:val="20"/>
-          <w:szCs w:val="20"/>
-        </w:rPr>
-        <w:t xml:space="preserve"> 4 </w:t>
+        <w:t>麦克纳姆轮由主动轮毂和沿轮缘分布的被动辊子组成，辊子手性决定侧向速度与轮毂转速之间的符号关系。Fig. 3(b) 和 (c)</w:t>
+      </w:r>
+      <w:r>
+        <w:rPr>
+          <w:sz w:val="20"/>
+          <w:szCs w:val="20"/>
+        </w:rPr>
+        <w:t xml:space="preserve"> </w:t>
       </w:r>
       <w:r>
         <w:rPr>
@@ -7223,223 +7447,6 @@
         <w:t>给出两种轮体结构。与普通车轮相比，被动辊子允许接触点沿特定方向运动，四轮适当配置后可产生前进、侧移和偏航运动。</w:t>
       </w:r>
     </w:p>
-    <w:tbl>
-      <w:tblPr>
-        <w:tblStyle w:val="10"/>
-        <w:tblW w:w="4760" w:type="dxa"/>
-        <w:jc w:val="center"/>
-        <w:tblBorders>
-          <w:top w:val="none" w:color="auto" w:sz="0" w:space="0"/>
-          <w:left w:val="none" w:color="auto" w:sz="0" w:space="0"/>
-          <w:bottom w:val="none" w:color="auto" w:sz="0" w:space="0"/>
-          <w:right w:val="none" w:color="auto" w:sz="0" w:space="0"/>
-          <w:insideH w:val="none" w:color="auto" w:sz="0" w:space="0"/>
-          <w:insideV w:val="none" w:color="auto" w:sz="0" w:space="0"/>
-        </w:tblBorders>
-        <w:tblLayout w:type="fixed"/>
-        <w:tblCellMar>
-          <w:top w:w="0" w:type="dxa"/>
-          <w:left w:w="40" w:type="dxa"/>
-          <w:bottom w:w="0" w:type="dxa"/>
-          <w:right w:w="40" w:type="dxa"/>
-        </w:tblCellMar>
-      </w:tblPr>
-      <w:tblGrid>
-        <w:gridCol w:w="2380"/>
-        <w:gridCol w:w="2380"/>
-      </w:tblGrid>
-      <w:tr>
-        <w:tblPrEx>
-          <w:tblBorders>
-            <w:top w:val="none" w:color="auto" w:sz="0" w:space="0"/>
-            <w:left w:val="none" w:color="auto" w:sz="0" w:space="0"/>
-            <w:bottom w:val="none" w:color="auto" w:sz="0" w:space="0"/>
-            <w:right w:val="none" w:color="auto" w:sz="0" w:space="0"/>
-            <w:insideH w:val="none" w:color="auto" w:sz="0" w:space="0"/>
-            <w:insideV w:val="none" w:color="auto" w:sz="0" w:space="0"/>
-          </w:tblBorders>
-          <w:tblCellMar>
-            <w:top w:w="0" w:type="dxa"/>
-            <w:left w:w="40" w:type="dxa"/>
-            <w:bottom w:w="0" w:type="dxa"/>
-            <w:right w:w="40" w:type="dxa"/>
-          </w:tblCellMar>
-        </w:tblPrEx>
-        <w:trPr>
-          <w:cantSplit/>
-          <w:jc w:val="center"/>
-        </w:trPr>
-        <w:tc>
-          <w:tcPr>
-            <w:tcW w:w="2380" w:type="dxa"/>
-            <w:vAlign w:val="top"/>
-          </w:tcPr>
-          <w:p>
-            <w:pPr>
-              <w:keepNext/>
-              <w:numPr>
-                <w:ilvl w:val="0"/>
-                <w:numId w:val="0"/>
-              </w:numPr>
-              <w:snapToGrid w:val="0"/>
-              <w:spacing w:before="0" w:after="40" w:line="240" w:lineRule="auto"/>
-              <w:ind w:left="0" w:right="0" w:firstLine="0"/>
-              <w:jc w:val="center"/>
-            </w:pPr>
-            <w:r>
-              <w:drawing>
-                <wp:inline distT="0" distB="0" distL="0" distR="0">
-                  <wp:extent cx="1439545" cy="467995"/>
-                  <wp:effectExtent l="0" t="0" r="5080" b="6985"/>
-                  <wp:docPr id="20" name="Picture" descr="Fig. 4(a). A 型麦克纳姆轮结构。"/>
-                  <wp:cNvGraphicFramePr>
-                    <a:graphicFrameLocks xmlns:a="http://schemas.openxmlformats.org/drawingml/2006/main" noChangeAspect="1"/>
-                  </wp:cNvGraphicFramePr>
-                  <a:graphic xmlns:a="http://schemas.openxmlformats.org/drawingml/2006/main">
-                    <a:graphicData uri="http://schemas.openxmlformats.org/drawingml/2006/picture">
-                      <pic:pic xmlns:pic="http://schemas.openxmlformats.org/drawingml/2006/picture">
-                        <pic:nvPicPr>
-                          <pic:cNvPr id="20" name="Picture" descr="Fig. 4(a). A 型麦克纳姆轮结构。"/>
-                          <pic:cNvPicPr>
-                            <a:picLocks noChangeAspect="1" noChangeArrowheads="1"/>
-                          </pic:cNvPicPr>
-                        </pic:nvPicPr>
-                        <pic:blipFill>
-                          <a:blip r:embed="rId8"/>
-                          <a:srcRect l="4706" t="17564" r="8015" b="15381"/>
-                          <a:stretch>
-                            <a:fillRect/>
-                          </a:stretch>
-                        </pic:blipFill>
-                        <pic:spPr>
-                          <a:xfrm>
-                            <a:off x="0" y="0"/>
-                            <a:ext cx="1440000" cy="468623"/>
-                          </a:xfrm>
-                          <a:prstGeom prst="rect">
-                            <a:avLst/>
-                          </a:prstGeom>
-                          <a:noFill/>
-                          <a:ln w="9525">
-                            <a:noFill/>
-                          </a:ln>
-                        </pic:spPr>
-                      </pic:pic>
-                    </a:graphicData>
-                  </a:graphic>
-                </wp:inline>
-              </w:drawing>
-            </w:r>
-          </w:p>
-          <w:p>
-            <w:pPr>
-              <w:pStyle w:val="18"/>
-              <w:numPr>
-                <w:ilvl w:val="0"/>
-                <w:numId w:val="0"/>
-              </w:numPr>
-              <w:snapToGrid w:val="0"/>
-              <w:spacing w:before="0" w:after="40" w:line="240" w:lineRule="auto"/>
-              <w:ind w:left="0" w:right="0" w:firstLine="0"/>
-              <w:jc w:val="center"/>
-            </w:pPr>
-            <w:r>
-              <w:t xml:space="preserve">Fig. 4(a). A </w:t>
-            </w:r>
-            <w:r>
-              <w:rPr>
-                <w:rFonts w:hint="eastAsia"/>
-              </w:rPr>
-              <w:t>型麦克纳姆轮结构。</w:t>
-            </w:r>
-          </w:p>
-        </w:tc>
-        <w:tc>
-          <w:tcPr>
-            <w:tcW w:w="2380" w:type="dxa"/>
-            <w:vAlign w:val="top"/>
-          </w:tcPr>
-          <w:p>
-            <w:pPr>
-              <w:keepNext/>
-              <w:numPr>
-                <w:ilvl w:val="0"/>
-                <w:numId w:val="0"/>
-              </w:numPr>
-              <w:snapToGrid w:val="0"/>
-              <w:spacing w:before="0" w:after="40" w:line="240" w:lineRule="auto"/>
-              <w:ind w:left="0" w:right="0" w:firstLine="0"/>
-              <w:jc w:val="center"/>
-            </w:pPr>
-            <w:r>
-              <w:drawing>
-                <wp:inline distT="0" distB="0" distL="0" distR="0">
-                  <wp:extent cx="1439545" cy="461010"/>
-                  <wp:effectExtent l="0" t="0" r="0" b="0"/>
-                  <wp:docPr id="23" name="Picture" descr="Fig. 4(b). B 型麦克纳姆轮结构。"/>
-                  <wp:cNvGraphicFramePr>
-                    <a:graphicFrameLocks xmlns:a="http://schemas.openxmlformats.org/drawingml/2006/main" noChangeAspect="1"/>
-                  </wp:cNvGraphicFramePr>
-                  <a:graphic xmlns:a="http://schemas.openxmlformats.org/drawingml/2006/main">
-                    <a:graphicData uri="http://schemas.openxmlformats.org/drawingml/2006/picture">
-                      <pic:pic xmlns:pic="http://schemas.openxmlformats.org/drawingml/2006/picture">
-                        <pic:nvPicPr>
-                          <pic:cNvPr id="23" name="Picture" descr="Fig. 4(b). B 型麦克纳姆轮结构。"/>
-                          <pic:cNvPicPr>
-                            <a:picLocks noChangeAspect="1" noChangeArrowheads="1"/>
-                          </pic:cNvPicPr>
-                        </pic:nvPicPr>
-                        <pic:blipFill>
-                          <a:blip r:embed="rId9"/>
-                          <a:stretch>
-                            <a:fillRect/>
-                          </a:stretch>
-                        </pic:blipFill>
-                        <pic:spPr>
-                          <a:xfrm>
-                            <a:off x="0" y="0"/>
-                            <a:ext cx="1440000" cy="461356"/>
-                          </a:xfrm>
-                          <a:prstGeom prst="rect">
-                            <a:avLst/>
-                          </a:prstGeom>
-                          <a:noFill/>
-                          <a:ln w="9525">
-                            <a:noFill/>
-                          </a:ln>
-                        </pic:spPr>
-                      </pic:pic>
-                    </a:graphicData>
-                  </a:graphic>
-                </wp:inline>
-              </w:drawing>
-            </w:r>
-          </w:p>
-          <w:p>
-            <w:pPr>
-              <w:pStyle w:val="18"/>
-              <w:numPr>
-                <w:ilvl w:val="0"/>
-                <w:numId w:val="0"/>
-              </w:numPr>
-              <w:snapToGrid w:val="0"/>
-              <w:spacing w:before="0" w:after="40" w:line="240" w:lineRule="auto"/>
-              <w:ind w:left="0" w:right="0" w:firstLine="0"/>
-              <w:jc w:val="center"/>
-            </w:pPr>
-            <w:r>
-              <w:t xml:space="preserve">Fig. 4(b). B </w:t>
-            </w:r>
-            <w:r>
-              <w:rPr>
-                <w:rFonts w:hint="eastAsia"/>
-              </w:rPr>
-              <w:t>型麦克纳姆轮结构。</w:t>
-            </w:r>
-          </w:p>
-        </w:tc>
-      </w:tr>
-    </w:tbl>
     <w:p>
       <w:pPr>
         <w:pStyle w:val="7"/>
@@ -9783,7 +9790,7 @@
           <w:sz w:val="20"/>
           <w:szCs w:val="20"/>
         </w:rPr>
-        <w:t>。Fig. 5 给出轮受力示意图。</w:t>
+        <w:t>。Fig. 4 给出轮受力示意图。</w:t>
       </w:r>
     </w:p>
     <w:p>
@@ -9804,7 +9811,7 @@
           <wp:inline distT="0" distB="0" distL="0" distR="0">
             <wp:extent cx="2879725" cy="1508125"/>
             <wp:effectExtent l="0" t="0" r="0" b="0"/>
-            <wp:docPr id="25" name="Fig. 5" descr="车轮受力示意图：接触力、轴端作用力、重力、驱动力矩与力臂"/>
+            <wp:docPr id="25" name="Fig. 4" descr="车轮受力示意图：接触力、轴端作用力、重力、驱动力矩与力臂"/>
             <wp:cNvGraphicFramePr>
               <a:graphicFrameLocks xmlns:a="http://schemas.openxmlformats.org/drawingml/2006/main" noChangeAspect="1"/>
             </wp:cNvGraphicFramePr>
@@ -9812,7 +9819,7 @@
               <a:graphicData uri="http://schemas.openxmlformats.org/drawingml/2006/picture">
                 <pic:pic xmlns:pic="http://schemas.openxmlformats.org/drawingml/2006/picture">
                   <pic:nvPicPr>
-                    <pic:cNvPr id="25" name="Fig. 5" descr="车轮受力示意图：接触力、轴端作用力、重力、驱动力矩与力臂"/>
+                    <pic:cNvPr id="25" name="Fig. 4" descr="车轮受力示意图：接触力、轴端作用力、重力、驱动力矩与力臂"/>
                     <pic:cNvPicPr>
                       <a:picLocks noChangeAspect="1"/>
                     </pic:cNvPicPr>
@@ -9853,7 +9860,7 @@
         <w:rPr>
           <w:iCs/>
         </w:rPr>
-        <w:t xml:space="preserve">Fig. 5. </w:t>
+        <w:t xml:space="preserve">Fig. 4. </w:t>
       </w:r>
       <w:r>
         <w:rPr>
@@ -13439,14 +13446,14 @@
           <w:sz w:val="20"/>
           <w:szCs w:val="20"/>
         </w:rPr>
-        <w:t>个触点的矢量。Fig.</w:t>
-      </w:r>
-      <w:r>
-        <w:rPr>
-          <w:sz w:val="20"/>
-          <w:szCs w:val="20"/>
-        </w:rPr>
-        <w:t xml:space="preserve"> 6 </w:t>
+        <w:t>个触点的矢量。Fig. 5</w:t>
+      </w:r>
+      <w:r>
+        <w:rPr>
+          <w:sz w:val="20"/>
+          <w:szCs w:val="20"/>
+        </w:rPr>
+        <w:t xml:space="preserve"> </w:t>
       </w:r>
       <w:r>
         <w:rPr>
@@ -13475,7 +13482,7 @@
           <wp:inline distT="0" distB="0" distL="0" distR="0">
             <wp:extent cx="3059430" cy="2129790"/>
             <wp:effectExtent l="0" t="0" r="0" b="0"/>
-            <wp:docPr id="26" name="Fig. 6" descr="基于底盘立体构型的整机质心与四轮接触力示意图"/>
+            <wp:docPr id="26" name="Fig. 5" descr="基于底盘立体构型的整机质心与四轮接触力示意图"/>
             <wp:cNvGraphicFramePr>
               <a:graphicFrameLocks xmlns:a="http://schemas.openxmlformats.org/drawingml/2006/main" noChangeAspect="1"/>
             </wp:cNvGraphicFramePr>
@@ -13483,7 +13490,7 @@
               <a:graphicData uri="http://schemas.openxmlformats.org/drawingml/2006/picture">
                 <pic:pic xmlns:pic="http://schemas.openxmlformats.org/drawingml/2006/picture">
                   <pic:nvPicPr>
-                    <pic:cNvPr id="26" name="Fig. 6" descr="基于底盘立体构型的整机质心与四轮接触力示意图"/>
+                    <pic:cNvPr id="26" name="Fig. 5" descr="基于底盘立体构型的整机质心与四轮接触力示意图"/>
                     <pic:cNvPicPr>
                       <a:picLocks noChangeAspect="1"/>
                     </pic:cNvPicPr>
@@ -13528,7 +13535,7 @@
         <w:rPr>
           <w:iCs/>
         </w:rPr>
-        <w:t xml:space="preserve">Fig. 6. </w:t>
+        <w:t xml:space="preserve">Fig. 5. </w:t>
       </w:r>
       <w:r>
         <w:rPr>
@@ -16245,7 +16252,7 @@
           <w:sz w:val="20"/>
           <w:szCs w:val="20"/>
         </w:rPr>
-        <w:t xml:space="preserve">。闭环控制结构如 Fig. 7 所示。对任一姿态轴 </w:t>
+        <w:t xml:space="preserve">。闭环控制结构如 Fig. 6 所示。对任一姿态轴 </w:t>
       </w:r>
       <m:oMath>
         <m:r>
@@ -19154,7 +19161,7 @@
           <wp:inline distT="0" distB="0" distL="0" distR="0">
             <wp:extent cx="3059430" cy="4307840"/>
             <wp:effectExtent l="0" t="0" r="7620" b="6985"/>
-            <wp:docPr id="27" name="Fig. 7" descr="底盘姿态控制器闭环方框图"/>
+            <wp:docPr id="27" name="Fig. 6" descr="底盘姿态控制器闭环方框图"/>
             <wp:cNvGraphicFramePr>
               <a:graphicFrameLocks xmlns:a="http://schemas.openxmlformats.org/drawingml/2006/main" noChangeAspect="1"/>
             </wp:cNvGraphicFramePr>
@@ -19162,7 +19169,7 @@
               <a:graphicData uri="http://schemas.openxmlformats.org/drawingml/2006/picture">
                 <pic:pic xmlns:pic="http://schemas.openxmlformats.org/drawingml/2006/picture">
                   <pic:nvPicPr>
-                    <pic:cNvPr id="27" name="Fig. 7" descr="底盘姿态控制器闭环方框图"/>
+                    <pic:cNvPr id="27" name="Fig. 6" descr="底盘姿态控制器闭环方框图"/>
                     <pic:cNvPicPr>
                       <a:picLocks noChangeAspect="1"/>
                     </pic:cNvPicPr>
@@ -19199,7 +19206,7 @@
         <w:snapToGrid w:val="0"/>
       </w:pPr>
       <w:r>
-        <w:t>Fig. 7. 底盘姿态控制器闭环方框图。滚转与俯仰分别采用(18)的双环 P 控制及高度增量累加，两轴修正量经(19)共同分配至四腿；关节伺服内环合并表示。</w:t>
+        <w:t>Fig. 6. 底盘姿态控制器闭环方框图。滚转与俯仰分别采用(18)的双环 P 控制及高度增量累加，两轴修正量经(19)共同分配至四腿；关节伺服内环合并表示。</w:t>
       </w:r>
     </w:p>
     <w:bookmarkEnd w:id="4"/>
@@ -19344,7 +19351,7 @@
           <w:sz w:val="20"/>
           <w:szCs w:val="20"/>
         </w:rPr>
-        <w:t>本文采用 Pieper [11] 针对末三轴相交的六轴机械臂提出的解析逆解方法。针对 Fig. 8 所示的肘式臂—球腕构型，按本文的 DH 坐标系与关节零位约定，直接给出所选分支的最终关节角公式。</w:t>
+        <w:t>本文采用 Pieper [11] 针对末三轴相交的六轴机械臂提出的解析逆解方法。针对 Fig. 7 所示的肘式臂—球腕构型，按本文的 DH 坐标系与关节零位约定，直接给出所选分支的最终关节角公式。</w:t>
       </w:r>
     </w:p>
     <w:p>
@@ -19365,7 +19372,7 @@
           <wp:inline distT="0" distB="0" distL="0" distR="0">
             <wp:extent cx="3059430" cy="1019810"/>
             <wp:effectExtent l="0" t="0" r="7620" b="8890"/>
-            <wp:docPr id="28" name="Fig. 8" descr="机械臂侧视图上的关节坐标系定义"/>
+            <wp:docPr id="28" name="Fig. 7" descr="机械臂侧视图上的关节坐标系定义"/>
             <wp:cNvGraphicFramePr>
               <a:graphicFrameLocks xmlns:a="http://schemas.openxmlformats.org/drawingml/2006/main" noChangeAspect="1"/>
             </wp:cNvGraphicFramePr>
@@ -19373,7 +19380,7 @@
               <a:graphicData uri="http://schemas.openxmlformats.org/drawingml/2006/picture">
                 <pic:pic xmlns:pic="http://schemas.openxmlformats.org/drawingml/2006/picture">
                   <pic:nvPicPr>
-                    <pic:cNvPr id="28" name="Fig. 8" descr="机械臂侧视图上的关节坐标系定义"/>
+                    <pic:cNvPr id="28" name="Fig. 7" descr="机械臂侧视图上的关节坐标系定义"/>
                     <pic:cNvPicPr>
                       <a:picLocks noChangeAspect="1"/>
                     </pic:cNvPicPr>
@@ -19440,7 +19447,7 @@
           <wp:inline distT="0" distB="0" distL="0" distR="0">
             <wp:extent cx="3059430" cy="1520190"/>
             <wp:effectExtent l="0" t="0" r="7620" b="8890"/>
-            <wp:docPr id="34" name="Fig. 8(b)" descr="Arm joint coordinate frames and link dimensions"/>
+            <wp:docPr id="34" name="Fig. 7(b)" descr="Arm joint coordinate frames and link dimensions"/>
             <wp:cNvGraphicFramePr>
               <a:graphicFrameLocks xmlns:a="http://schemas.openxmlformats.org/drawingml/2006/main" noChangeAspect="1"/>
             </wp:cNvGraphicFramePr>
@@ -19448,7 +19455,7 @@
               <a:graphicData uri="http://schemas.openxmlformats.org/drawingml/2006/picture">
                 <pic:pic xmlns:pic="http://schemas.openxmlformats.org/drawingml/2006/picture">
                   <pic:nvPicPr>
-                    <pic:cNvPr id="34" name="Fig. 8(b)" descr="Arm joint coordinate frames and link dimensions"/>
+                    <pic:cNvPr id="34" name="Fig. 7(b)" descr="Arm joint coordinate frames and link dimensions"/>
                     <pic:cNvPicPr>
                       <a:picLocks noChangeAspect="1"/>
                     </pic:cNvPicPr>
@@ -19510,7 +19517,7 @@
         <w:rPr>
           <w:iCs/>
         </w:rPr>
-        <w:t>Fig. 8. 六轴机械臂关节坐标系。（a）侧视图上的坐标系对应位置。（b）关节坐标系与连杆尺寸定义。坐标系 2、3 的原点重合，坐标系 4、5 的原点重合。</w:t>
+        <w:t>Fig. 7. 六轴机械臂关节坐标系。（a）侧视图上的坐标系对应位置。（b）关节坐标系与连杆尺寸定义。坐标系 2、3 的原点重合，坐标系 4、5 的原点重合。</w:t>
       </w:r>
     </w:p>
     <w:p>
@@ -23289,7 +23296,7 @@
           <w:sz w:val="20"/>
           <w:szCs w:val="20"/>
         </w:rPr>
-        <w:t xml:space="preserve">。Fig. 9 </w:t>
+        <w:t xml:space="preserve">。Fig. 8 </w:t>
       </w:r>
       <w:r>
         <w:rPr>
@@ -23388,7 +23395,7 @@
           <wp:inline distT="0" distB="0" distL="0" distR="0">
             <wp:extent cx="3059430" cy="2039620"/>
             <wp:effectExtent l="0" t="0" r="7620" b="8255"/>
-            <wp:docPr id="29" name="Fig. 9" descr="Delta 平移机构与三轴姿态手柄的机构、转轴和平行约束示意"/>
+            <wp:docPr id="29" name="Fig. 8" descr="Delta 平移机构与三轴姿态手柄的机构、转轴和平行约束示意"/>
             <wp:cNvGraphicFramePr>
               <a:graphicFrameLocks xmlns:a="http://schemas.openxmlformats.org/drawingml/2006/main" noChangeAspect="1"/>
             </wp:cNvGraphicFramePr>
@@ -23396,7 +23403,7 @@
               <a:graphicData uri="http://schemas.openxmlformats.org/drawingml/2006/picture">
                 <pic:pic xmlns:pic="http://schemas.openxmlformats.org/drawingml/2006/picture">
                   <pic:nvPicPr>
-                    <pic:cNvPr id="29" name="Fig. 9" descr="Delta 平移机构与三轴姿态手柄的机构、转轴和平行约束示意"/>
+                    <pic:cNvPr id="29" name="Fig. 8" descr="Delta 平移机构与三轴姿态手柄的机构、转轴和平行约束示意"/>
                     <pic:cNvPicPr>
                       <a:picLocks noChangeAspect="1"/>
                     </pic:cNvPicPr>
@@ -23436,7 +23443,7 @@
         <w:rPr>
           <w:iCs/>
         </w:rPr>
-        <w:t xml:space="preserve">Fig. 9. </w:t>
+        <w:t xml:space="preserve">Fig. 8. </w:t>
       </w:r>
       <w:r>
         <w:rPr>
@@ -24233,7 +24240,7 @@
           <w:sz w:val="20"/>
           <w:szCs w:val="20"/>
         </w:rPr>
-        <w:t xml:space="preserve"> 工作侧转动为正。几何关系如 Fig. 10 所示；单支链图采用对称构型展示角度与长度定义，虚线段对应(23)中的等效长度约束。</w:t>
+        <w:t xml:space="preserve"> 工作侧转动为正。几何关系如 Fig. 9 所示；单支链图采用对称构型展示角度与长度定义，虚线段对应(23)中的等效长度约束。</w:t>
       </w:r>
     </w:p>
     <w:p>
@@ -24254,7 +24261,7 @@
           <wp:inline distT="0" distB="0" distL="0" distR="0">
             <wp:extent cx="3059430" cy="2045970"/>
             <wp:effectExtent l="0" t="0" r="0" b="0"/>
-            <wp:docPr id="30" name="Fig. 10" descr="Delta 三支链及单支链几何模型，基座原点位于静平台中心"/>
+            <wp:docPr id="30" name="Fig. 9" descr="Delta 三支链及单支链几何模型，基座原点位于静平台中心"/>
             <wp:cNvGraphicFramePr>
               <a:graphicFrameLocks xmlns:a="http://schemas.openxmlformats.org/drawingml/2006/main" noChangeAspect="1"/>
             </wp:cNvGraphicFramePr>
@@ -24262,7 +24269,7 @@
               <a:graphicData uri="http://schemas.openxmlformats.org/drawingml/2006/picture">
                 <pic:pic xmlns:pic="http://schemas.openxmlformats.org/drawingml/2006/picture">
                   <pic:nvPicPr>
-                    <pic:cNvPr id="30" name="Fig. 10" descr="Delta 三支链及单支链几何模型，基座原点位于静平台中心"/>
+                    <pic:cNvPr id="30" name="Fig. 9" descr="Delta 三支链及单支链几何模型，基座原点位于静平台中心"/>
                     <pic:cNvPicPr>
                       <a:picLocks noChangeAspect="1"/>
                     </pic:cNvPicPr>
@@ -24299,7 +24306,7 @@
         <w:snapToGrid w:val="0"/>
       </w:pPr>
       <w:r>
-        <w:t>Fig. 10. Delta 机械臂几何模型。（a）三支链构型，基座原点 O 位于静平台中心，正 x 轴沿平台法向由动平台指向静平台，正 z 轴从 O 指向 A1，三轴按右手系定义；动平台中心为 P，成对从动杆构成平行四边形并保持两平台平行。（b）对称构型下的单支链剖面，标出平台半径、杆长、主动臂角及等效球心。</w:t>
+        <w:t>Fig. 9. Delta 机械臂几何模型。（a）三支链构型，基座原点 O 位于静平台中心，正 x 轴沿平台法向由动平台指向静平台，正 z 轴从 O 指向 A1，三轴按右手系定义；动平台中心为 P，成对从动杆构成平行四边形并保持两平台平行。（b）对称构型下的单支链剖面，标出平台半径、杆长、主动臂角及等效球心。</w:t>
       </w:r>
     </w:p>
     <w:p>
@@ -33338,7 +33345,7 @@
           <w:sz w:val="20"/>
           <w:szCs w:val="20"/>
         </w:rPr>
-        <w:t>位置绘制为三维点云及径向–高度投影，如 Fig. 11(a) 和 (b) 所示。</w:t>
+        <w:t>位置绘制为三维点云及径向–高度投影，如 Fig. 10(a) 和 (b) 所示。</w:t>
       </w:r>
     </w:p>
     <w:p>
@@ -33514,7 +33521,7 @@
           <w:sz w:val="20"/>
           <w:szCs w:val="20"/>
         </w:rPr>
-        <w:t>几何可达位置，并将结果统一表达于本文定义的右手坐标系 {D}。Fig. 11(c) 给出三维工作空间示意</w:t>
+        <w:t>几何可达位置，并将结果统一表达于本文定义的右手坐标系 {D}。Fig. 10(c) 给出三维工作空间示意</w:t>
       </w:r>
       <w:r>
         <w:rPr>
@@ -33916,7 +33923,7 @@
           <wp:inline distT="0" distB="0" distL="0" distR="0">
             <wp:extent cx="5939790" cy="1979930"/>
             <wp:effectExtent l="0" t="0" r="0" b="0"/>
-            <wp:docPr id="37" name="Fig. 11" descr="Gripper 3D workspace, radial-height projection, and Delta workspace; horizontal three-panel figure"/>
+            <wp:docPr id="37" name="Fig. 10" descr="Gripper 3D workspace, radial-height projection, and Delta workspace; horizontal three-panel figure"/>
             <wp:cNvGraphicFramePr>
               <a:graphicFrameLocks xmlns:a="http://schemas.openxmlformats.org/drawingml/2006/main" noChangeAspect="1"/>
             </wp:cNvGraphicFramePr>
@@ -33924,7 +33931,7 @@
               <a:graphicData uri="http://schemas.openxmlformats.org/drawingml/2006/picture">
                 <pic:pic xmlns:pic="http://schemas.openxmlformats.org/drawingml/2006/picture">
                   <pic:nvPicPr>
-                    <pic:cNvPr id="37" name="Fig. 11" descr="Gripper 3D workspace, radial-height projection, and Delta workspace; horizontal three-panel figure"/>
+                    <pic:cNvPr id="37" name="Fig. 10" descr="Gripper 3D workspace, radial-height projection, and Delta workspace; horizontal three-panel figure"/>
                     <pic:cNvPicPr>
                       <a:picLocks noChangeAspect="1"/>
                     </pic:cNvPicPr>
@@ -33973,7 +33980,7 @@
           <w:sz w:val="18"/>
           <w:szCs w:val="18"/>
         </w:rPr>
-        <w:t xml:space="preserve">Fig. 11. 机械臂与遥操作控制器的工作空间。（a）夹爪中心的三维采样点云。（b）夹爪中心的径向–高度投影。（c）Delta 动平台中心的三维工作空间示意，工作侧为 </w:t>
+        <w:t xml:space="preserve">Fig. 10. 机械臂与遥操作控制器的工作空间。（a）夹爪中心的三维采样点云。（b）夹爪中心的径向–高度投影。（c）Delta 动平台中心的三维工作空间示意，工作侧为 </w:t>
       </w:r>
       <m:oMath>
         <m:sSub>
@@ -34213,7 +34220,7 @@
           <w:sz w:val="20"/>
           <w:szCs w:val="20"/>
         </w:rPr>
-        <w:t xml:space="preserve">Fig. 12 </w:t>
+        <w:t xml:space="preserve">Fig. 11 </w:t>
       </w:r>
       <w:r>
         <w:rPr>
@@ -34305,7 +34312,7 @@
           <w:sz w:val="20"/>
           <w:szCs w:val="20"/>
         </w:rPr>
-        <w:t>操作者通过 Delta 动平台输入位置，并利用三轴手柄调整末端姿态，操作效果如 Fig. 13 所示。向前和向右抓取时，夹爪分别从不同方向接近并夹持杯体；斜向上和斜向下操作时，机械臂末端呈现相应的倾斜姿态。图中同时保留主手与机器人端，展示操作者输入和从端动作的对应关系，说明位姿映射与关节控制能够用于实际的末端调整和抓取操作。</w:t>
+        <w:t>操作者通过 Delta 动平台输入位置，并利用三轴手柄调整末端姿态，操作效果如 Fig. 12 所示。向前和向右抓取时，夹爪分别从不同方向接近并夹持杯体；斜向上和斜向下操作时，机械臂末端呈现相应的倾斜姿态。图中同时保留主手与机器人端，展示操作者输入和从端动作的对应关系，说明位姿映射与关节控制能够用于实际的末端调整和抓取操作。</w:t>
       </w:r>
     </w:p>
     <w:p>
@@ -34353,7 +34360,7 @@
           <w:sz w:val="20"/>
           <w:szCs w:val="20"/>
         </w:rPr>
-        <w:t>Fig. 14 按时间顺序给出机器人连续通过两级台阶的关键过程。机器人由下方地面接近台阶后，通过腿部构型调整与车轮前进配合，使前、后轮依次转移至第一级踏面；随后继续调整支撑并向前移动，完成第二级台阶的跨越，最终四轮均位于上方平台。过程中机械臂</w:t>
+        <w:t>Fig. 13 按时间顺序给出机器人连续通过两级台阶的关键过程。机器人由下方地面接近台阶后，通过腿部构型调整与车轮前进配合，使前、后轮依次转移至第一级踏面；随后继续调整支撑并向前移动，完成第二级台阶的跨越，最终四轮均位于上方平台。过程中机械臂</w:t>
       </w:r>
       <w:r>
         <w:rPr>
@@ -34434,7 +34441,7 @@
           <wp:inline distT="0" distB="0" distL="0" distR="0">
             <wp:extent cx="6191885" cy="1738630"/>
             <wp:effectExtent l="0" t="0" r="0" b="0"/>
-            <wp:docPr id="38" name="Fig. 12" descr="机械臂运动空间的实物展示。（a）向前伸展。（b）向上抬升。（c）向下探取。三幅图分别给出前向、上方及近地面区域的典型可达构型。"/>
+            <wp:docPr id="38" name="Fig. 11" descr="机械臂运动空间的实物展示。（a）向前伸展。（b）向上抬升。（c）向下探取。三幅图分别给出前向、上方及近地面区域的典型可达构型。"/>
             <wp:cNvGraphicFramePr>
               <a:graphicFrameLocks xmlns:a="http://schemas.openxmlformats.org/drawingml/2006/main" noChangeAspect="1"/>
             </wp:cNvGraphicFramePr>
@@ -34442,7 +34449,7 @@
               <a:graphicData uri="http://schemas.openxmlformats.org/drawingml/2006/picture">
                 <pic:pic xmlns:pic="http://schemas.openxmlformats.org/drawingml/2006/picture">
                   <pic:nvPicPr>
-                    <pic:cNvPr id="38" name="Fig. 12" descr="机械臂运动空间的实物展示。（a）向前伸展。（b）向上抬升。（c）向下探取。三幅图分别给出前向、上方及近地面区域的典型可达构型。"/>
+                    <pic:cNvPr id="38" name="Fig. 11" descr="机械臂运动空间的实物展示。（a）向前伸展。（b）向上抬升。（c）向下探取。三幅图分别给出前向、上方及近地面区域的典型可达构型。"/>
                     <pic:cNvPicPr>
                       <a:picLocks noChangeAspect="1"/>
                     </pic:cNvPicPr>
@@ -34486,7 +34493,7 @@
           <w:sz w:val="18"/>
           <w:szCs w:val="18"/>
         </w:rPr>
-        <w:t>Fig. 12. 机械臂运动空间的实物展示。（a）向前伸展。（b）向上抬升。（c）向下探取。三幅图分别给出前向、上方及近地面区域的典型可达构型。</w:t>
+        <w:t>Fig. 11. 机械臂运动空间的实物展示。（a）向前伸展。（b）向上抬升。（c）向下探取。三幅图分别给出前向、上方及近地面区域的典型可达构型。</w:t>
       </w:r>
     </w:p>
     <w:p>
@@ -34563,7 +34570,7 @@
           <w:sz w:val="18"/>
           <w:szCs w:val="18"/>
         </w:rPr>
-        <w:t>Fig. 13. Delta 主手遥操作效果。（a）向前抓取。（b）向右抓取。（c）斜向上姿态调整。（d）斜向下姿态调整。各子图左侧为操作者与主手，右侧为机器人及机械臂。</w:t>
+        <w:t>Fig. 12. Delta 主手遥操作效果。（a）向前抓取。（b）向右抓取。（c）斜向上姿态调整。（d）斜向下姿态调整。各子图左侧为操作者与主手，右侧为机器人及机械臂。</w:t>
       </w:r>
     </w:p>
     <w:p>
@@ -34584,7 +34591,7 @@
           <wp:inline distT="0" distB="0" distL="0" distR="0">
             <wp:extent cx="6191885" cy="2727325"/>
             <wp:effectExtent l="0" t="0" r="0" b="0"/>
-            <wp:docPr id="40" name="Fig. 14" descr="连续上台阶过程。子图按先上后下、每行从左至右排列，标注时间为视频相对时刻。（a）初始接近。（b）—（d）前、后轮依次通过第一级台阶。（e）—（g）继续通过第二级台阶。（h）四轮登上平台，完成通过。"/>
+            <wp:docPr id="40" name="Fig. 13" descr="连续上台阶过程。子图按先上后下、每行从左至右排列，标注时间为视频相对时刻。（a）初始接近。（b）—（d）前、后轮依次通过第一级台阶。（e）—（g）继续通过第二级台阶。（h）四轮登上平台，完成通过。"/>
             <wp:cNvGraphicFramePr>
               <a:graphicFrameLocks xmlns:a="http://schemas.openxmlformats.org/drawingml/2006/main" noChangeAspect="1"/>
             </wp:cNvGraphicFramePr>
@@ -34592,7 +34599,7 @@
               <a:graphicData uri="http://schemas.openxmlformats.org/drawingml/2006/picture">
                 <pic:pic xmlns:pic="http://schemas.openxmlformats.org/drawingml/2006/picture">
                   <pic:nvPicPr>
-                    <pic:cNvPr id="40" name="Fig. 14" descr="连续上台阶过程。子图按先上后下、每行从左至右排列，标注时间为视频相对时刻。（a）初始接近。（b）—（d）前、后轮依次通过第一级台阶。（e）—（g）继续通过第二级台阶。（h）四轮登上平台，完成通过。"/>
+                    <pic:cNvPr id="40" name="Fig. 13" descr="连续上台阶过程。子图按先上后下、每行从左至右排列，标注时间为视频相对时刻。（a）初始接近。（b）—（d）前、后轮依次通过第一级台阶。（e）—（g）继续通过第二级台阶。（h）四轮登上平台，完成通过。"/>
                     <pic:cNvPicPr>
                       <a:picLocks noChangeAspect="1"/>
                     </pic:cNvPicPr>
@@ -34643,7 +34650,7 @@
           <w:sz w:val="18"/>
           <w:szCs w:val="18"/>
         </w:rPr>
-        <w:t>Fig. 14. 连续上台阶过程。子图按先上后下、每行从左至右排列，标注时间为视频相对时刻。（a）初始接近。（b）—（d）前、后轮依次通过第一级台阶。（e）—（g）继续通过第二级台阶。（h）四轮登上平台，完成通过。</w:t>
+        <w:t>Fig. 13. 连续上台阶过程。子图按先上后下、每行从左至右排列，标注时间为视频相对时刻。（a）初始接近。（b）—（d）前、后轮依次通过第一级台阶。（e）—（g）继续通过第二级台阶。（h）四轮登上平台，完成通过。</w:t>
       </w:r>
     </w:p>
     <w:p>

</xml_diff>